<commit_message>
feat(sgd): actualizar acceso e imagen INIA y agregar utilitarios de carga por area
</commit_message>
<xml_diff>
--- a/manual/Manual-Instalacion-SGD-INIA-PG.docx
+++ b/manual/Manual-Instalacion-SGD-INIA-PG.docx
@@ -235,7 +235,57 @@
     </w:p>
     <w:p>
       <w:r>
-        <w:t>Abrir la raíz del paquete y editar fuentes. Las tareas de VS Code permiten compilar, desplegar y verificar. No editar target ni aplicaciones desplegadas: la compilación las reemplaza.</w:t>
+        <w:t>Abrir la raíz del paquete y editar fuentes. Compilar genera los WAR en binarios; no actualiza la aplicación que está ejecutando Payara. Desplegar reemplaza las aplicaciones por esos WAR y verificar comprueba sus accesos. Conservar la base y los documentos; no repetir la instalación inicial para publicar cambios de código.</w:t>
+      </w:r>
+    </w:p>
+    <w:p>
+      <w:r>
+        <w:t>Windows: ejecutar el siguiente comando o hacer doble clic en Actualizar-SGD.bat.</w:t>
+      </w:r>
+    </w:p>
+    <w:p>
+      <w:pPr>
+        <w:keepLines/>
+        <w:spacing w:line="240" w:lineRule="auto" w:before="80" w:after="180"/>
+      </w:pPr>
+      <w:r>
+        <w:rPr>
+          <w:rFonts w:ascii="Consolas" w:hAnsi="Consolas"/>
+          <w:sz w:val="18"/>
+        </w:rPr>
+        <w:t>cd C:\SGD\SGD-INIA-INSTALL_PG</w:t>
+        <w:br/>
+        <w:t>.\Actualizar-SGD.bat</w:t>
+      </w:r>
+    </w:p>
+    <w:p>
+      <w:r>
+        <w:t>Linux:</w:t>
+      </w:r>
+    </w:p>
+    <w:p>
+      <w:pPr>
+        <w:keepLines/>
+        <w:spacing w:line="240" w:lineRule="auto" w:before="80" w:after="180"/>
+      </w:pPr>
+      <w:r>
+        <w:rPr>
+          <w:rFonts w:ascii="Consolas" w:hAnsi="Consolas"/>
+          <w:sz w:val="18"/>
+        </w:rPr>
+        <w:t>cd /opt/sgd/SGD-INIA-INSTALL_PG</w:t>
+        <w:br/>
+        <w:t>bash Actualizar-SGD.sh</w:t>
+      </w:r>
+    </w:p>
+    <w:p>
+      <w:r>
+        <w:t>El lanzador compila, inicia PostgreSQL y Payara si corresponde, despliega y verifica, en ese orden. Se detiene si un paso falla; revisar el mensaje y logs/ULTIMO-ERROR.txt. En VS Code está disponible la tarea SGD: actualizar y verificar cambios.</w:t>
+      </w:r>
+    </w:p>
+    <w:p>
+      <w:r>
+        <w:t>Alternativa manual: esperar a que cada comando termine correctamente antes de ejecutar el siguiente.</w:t>
       </w:r>
     </w:p>
     <w:p>
@@ -249,6 +299,8 @@
           <w:sz w:val="18"/>
         </w:rPr>
         <w:t>.\SGD.bat compilar</w:t>
+        <w:br/>
+        <w:t>.\SGD.bat iniciar</w:t>
         <w:br/>
         <w:t>.\SGD.bat desplegar</w:t>
         <w:br/>
@@ -267,9 +319,16 @@
         </w:rPr>
         <w:t>bash SGD.sh compilar</w:t>
         <w:br/>
+        <w:t>bash SGD.sh iniciar</w:t>
+        <w:br/>
         <w:t>bash SGD.sh desplegar</w:t>
         <w:br/>
         <w:t>bash SGD.sh verificar</w:t>
+      </w:r>
+    </w:p>
+    <w:p>
+      <w:r>
+        <w:t>Si ya se compiló correctamente y la pantalla sigue igual, no es necesario recompilar: ejecutar iniciar, desplegar y verificar. Después abrir http://127.0.0.1:8085/sisdoc/login.do y recargar con Ctrl+F5. Si persiste, revisar los logs de despliegue y confirmar la URL y el puerto de esta instalación.</w:t>
       </w:r>
     </w:p>
     <w:p>
@@ -445,6 +504,329 @@
     <w:p>
       <w:r>
         <w:t>La instalación en un Windows Server físico diferente todavía requiere ejecutar este procedimiento y verificar sus resultados allí. Java 8 y Payara 5 conservan la compatibilidad Java EE de SGD 4.7; no representan una migración Jakarta. Firma digital, PIDE, correo y HTTPS institucional requieren configuración y aceptación propias. Después del laboratorio sustituir ficticios por información institucional mediante una carga controlada.</w:t>
+      </w:r>
+    </w:p>
+    <w:p>
+      <w:r>
+        <w:br w:type="page"/>
+      </w:r>
+    </w:p>
+    <w:p>
+      <w:pPr>
+        <w:pStyle w:val="Heading1"/>
+      </w:pPr>
+      <w:r>
+        <w:t>10 Carga de usuarios verificados por área</w:t>
+      </w:r>
+    </w:p>
+    <w:p>
+      <w:pPr>
+        <w:spacing w:after="140"/>
+      </w:pPr>
+      <w:r>
+        <w:t>Para el piloto comenzar con UTI, Mesa de Partes y una unidad usuaria pequeña de la sede central. Seleccionar inicialmente 10 a 20 personas entre las tres áreas, con registrador, responsables y personal que emita y reciba documentos. Administración puede incorporarse como cuarta área si el recorrido documental lo requiere.</w:t>
+      </w:r>
+    </w:p>
+    <w:p>
+      <w:pPr>
+        <w:spacing w:after="140"/>
+      </w:pPr>
+      <w:r>
+        <w:t>Tú ejecutas las consultas del origen: bd/Consultar-Estructura-SQLServer.sql, bd/Revisar-Area-SQLServer.sql y bd/Exportar-Area-SQLServer.sql. En los dos últimos elegir @Oficina. Confirmar que estado 1 significa activo. Exportar dentro de datos; el utilitario no conecta a SQL Server.</w:t>
+      </w:r>
+    </w:p>
+    <w:p>
+      <w:pPr>
+        <w:spacing w:after="140"/>
+      </w:pPr>
+      <w:r>
+        <w:t>Crear las plantillas y consultar los permisos del catálogo local. Windows, desde la raíz del paquete:</w:t>
+      </w:r>
+    </w:p>
+    <w:p>
+      <w:pPr>
+        <w:keepLines/>
+        <w:spacing w:after="140"/>
+      </w:pPr>
+      <w:r>
+        <w:rPr>
+          <w:rFonts w:ascii="Consolas" w:hAnsi="Consolas"/>
+          <w:sz w:val="20"/>
+        </w:rPr>
+        <w:t>.\Cargar-Area.bat --plantilla --carpeta datos\carga-uti</w:t>
+      </w:r>
+      <w:r>
+        <w:br/>
+      </w:r>
+      <w:r>
+        <w:rPr>
+          <w:rFonts w:ascii="Consolas" w:hAnsi="Consolas"/>
+          <w:sz w:val="20"/>
+        </w:rPr>
+        <w:t>.\Cargar-Area.bat --catalogos</w:t>
+      </w:r>
+    </w:p>
+    <w:p>
+      <w:pPr>
+        <w:spacing w:after="140"/>
+      </w:pPr>
+      <w:r>
+        <w:t>Linux, desde la raíz del paquete:</w:t>
+      </w:r>
+    </w:p>
+    <w:p>
+      <w:pPr>
+        <w:keepLines/>
+        <w:spacing w:after="140"/>
+      </w:pPr>
+      <w:r>
+        <w:rPr>
+          <w:rFonts w:ascii="Consolas" w:hAnsi="Consolas"/>
+          <w:sz w:val="20"/>
+        </w:rPr>
+        <w:t>bash Cargar-Area.sh --plantilla --carpeta datos/carga-uti</w:t>
+      </w:r>
+      <w:r>
+        <w:br/>
+      </w:r>
+      <w:r>
+        <w:rPr>
+          <w:rFonts w:ascii="Consolas" w:hAnsi="Consolas"/>
+          <w:sz w:val="20"/>
+        </w:rPr>
+        <w:t>bash Cargar-Area.sh --catalogos</w:t>
+      </w:r>
+    </w:p>
+    <w:p>
+      <w:pPr>
+        <w:spacing w:after="140"/>
+      </w:pPr>
+      <w:r>
+        <w:t>Completar area.json con código, nombre, sigla, padre, nivel, sede, tipos documentales, titular y permisos aprobados. El padre 00000 es provisional. Consultar personalmente bd/Consultar-Catalogos-Piloto-PostgreSQL.sql para revisar los códigos del destino. Los códigos 51001, 52001, 101 y 1001 son ejemplos; reemplazarlos o aprobarlos explícitamente.</w:t>
+      </w:r>
+    </w:p>
+    <w:p>
+      <w:pPr>
+        <w:spacing w:after="140"/>
+      </w:pPr>
+      <w:r>
+        <w:t>Completar usuarios-verificados.csv a partir de tu revisión. Usar sus encabezados exactos y CSV UTF-8 separado por coma. Separar nombres y apellidos, confirmar DNI de ocho dígitos, código de empleado de cinco, cargo y perfil. Marcar cada fila verificado=SI; retirar usuarios pendientes. En area.json marcar aprobado=SI e indicar verificado_por. La plantilla marcada NO se rechaza. No incluir contraseñas o hashes.</w:t>
+      </w:r>
+    </w:p>
+    <w:p>
+      <w:pPr>
+        <w:spacing w:after="140"/>
+      </w:pPr>
+      <w:r>
+        <w:t>Validar primero sin consultar ni modificar bases de datos:</w:t>
+      </w:r>
+    </w:p>
+    <w:p>
+      <w:pPr>
+        <w:keepLines/>
+        <w:spacing w:after="140"/>
+      </w:pPr>
+      <w:r>
+        <w:rPr>
+          <w:rFonts w:ascii="Consolas" w:hAnsi="Consolas"/>
+          <w:sz w:val="20"/>
+        </w:rPr>
+        <w:t>.\Cargar-Area.bat --carpeta datos\carga-uti</w:t>
+      </w:r>
+      <w:r>
+        <w:br/>
+      </w:r>
+      <w:r>
+        <w:rPr>
+          <w:rFonts w:ascii="Consolas" w:hAnsi="Consolas"/>
+          <w:sz w:val="20"/>
+        </w:rPr>
+        <w:t>bash Cargar-Area.sh --carpeta datos/carga-uti</w:t>
+      </w:r>
+    </w:p>
+    <w:p>
+      <w:pPr>
+        <w:spacing w:after="140"/>
+      </w:pPr>
+      <w:r>
+        <w:t>Se genera un plan privado en datos; no ejecutarlo manualmente. El plan offline no comprueba colisiones actuales en PostgreSQL. El detalle de campos, permisos y alcance está en manual/CARGA-POR-AREA.md.</w:t>
+      </w:r>
+    </w:p>
+    <w:p>
+      <w:r>
+        <w:br w:type="page"/>
+      </w:r>
+    </w:p>
+    <w:p>
+      <w:pPr>
+        <w:pStyle w:val="Heading1"/>
+      </w:pPr>
+      <w:r>
+        <w:t>11 Aplicar y retirar un área del piloto</w:t>
+      </w:r>
+    </w:p>
+    <w:p>
+      <w:pPr>
+        <w:spacing w:after="140"/>
+      </w:pPr>
+      <w:r>
+        <w:t>Primero revisar los archivos y el plan. Aplicar en mantenimiento, con PostgreSQL iniciado y usuarios fuera de la aplicación. Para una instalación completa en un mismo equipo, detener el SGD y arrancar sólo su base:</w:t>
+      </w:r>
+    </w:p>
+    <w:p>
+      <w:pPr>
+        <w:keepLines/>
+        <w:spacing w:after="140"/>
+      </w:pPr>
+      <w:r>
+        <w:rPr>
+          <w:rFonts w:ascii="Consolas" w:hAnsi="Consolas"/>
+          <w:sz w:val="20"/>
+        </w:rPr>
+        <w:t>.\SGD.bat detener</w:t>
+      </w:r>
+      <w:r>
+        <w:br/>
+      </w:r>
+      <w:r>
+        <w:rPr>
+          <w:rFonts w:ascii="Consolas" w:hAnsi="Consolas"/>
+          <w:sz w:val="20"/>
+        </w:rPr>
+        <w:t>.\SGD.bat base</w:t>
+      </w:r>
+    </w:p>
+    <w:p>
+      <w:pPr>
+        <w:spacing w:after="140"/>
+      </w:pPr>
+      <w:r>
+        <w:t>En Linux usar bash SGD.sh detener y bash SGD.sh base. Si aplicación y base están en equipos separados, coordinar también la parada de la aplicación remota.</w:t>
+      </w:r>
+    </w:p>
+    <w:p>
+      <w:pPr>
+        <w:spacing w:after="140"/>
+      </w:pPr>
+      <w:r>
+        <w:t>Carga aprobada en Windows o Linux. Sustituir 51001 por el código de tu área:</w:t>
+      </w:r>
+    </w:p>
+    <w:p>
+      <w:pPr>
+        <w:keepLines/>
+        <w:spacing w:after="140"/>
+      </w:pPr>
+      <w:r>
+        <w:rPr>
+          <w:rFonts w:ascii="Consolas" w:hAnsi="Consolas"/>
+          <w:sz w:val="20"/>
+        </w:rPr>
+        <w:t>.\Cargar-Area.bat --carpeta datos\carga-uti --aplicar --confirmar CARGAR:51001</w:t>
+      </w:r>
+      <w:r>
+        <w:br/>
+      </w:r>
+      <w:r>
+        <w:rPr>
+          <w:rFonts w:ascii="Consolas" w:hAnsi="Consolas"/>
+          <w:sz w:val="20"/>
+        </w:rPr>
+        <w:t>bash Cargar-Area.sh --carpeta datos/carga-uti --aplicar --confirmar CARGAR:51001</w:t>
+      </w:r>
+    </w:p>
+    <w:p>
+      <w:pPr>
+        <w:spacing w:after="140"/>
+      </w:pPr>
+      <w:r>
+        <w:t>Antes del cambio se crea un respaldo completo y su SHA-256. La carga se aplica en una transacción y registra procedencia. Si falta la librería de cifrado, compilar primero con SGD.bat compilar o bash SGD.sh compilar. Revisar resultado.json y CLAVES-GENERADAS-PRIVADAS.json en la carpeta privada indicada; sólo las cuentas nuevas reciben esas claves. Las existentes conservan su contraseña. No distribuir claves de una ejecución fallida.</w:t>
+      </w:r>
+    </w:p>
+    <w:p>
+      <w:pPr>
+        <w:spacing w:after="140"/>
+      </w:pPr>
+      <w:r>
+        <w:t>Repetir archivos idénticos no duplica registros ni cambia claves. Datos incompatibles o un área ya cargada con archivos distintos se rechazan; no se sobrescriben. Una persona compartida conserva su oficina principal y necesita códigos, identidad y permisos globales compatibles. Las cuentas ficticias continúan hasta su sustitución controlada.</w:t>
+      </w:r>
+    </w:p>
+    <w:p>
+      <w:pPr>
+        <w:spacing w:after="140"/>
+      </w:pPr>
+      <w:r>
+        <w:t>Limpiar-BD sólo retira el área seleccionada cargada con este utilitario. Primero preparar su plan sin consultar la base:</w:t>
+      </w:r>
+    </w:p>
+    <w:p>
+      <w:pPr>
+        <w:keepLines/>
+        <w:spacing w:after="140"/>
+      </w:pPr>
+      <w:r>
+        <w:rPr>
+          <w:rFonts w:ascii="Consolas" w:hAnsi="Consolas"/>
+          <w:sz w:val="20"/>
+        </w:rPr>
+        <w:t>.\Limpiar-BD.bat --area 51001</w:t>
+      </w:r>
+      <w:r>
+        <w:br/>
+      </w:r>
+      <w:r>
+        <w:rPr>
+          <w:rFonts w:ascii="Consolas" w:hAnsi="Consolas"/>
+          <w:sz w:val="20"/>
+        </w:rPr>
+        <w:t>bash Limpiar-BD.sh --area 51001</w:t>
+      </w:r>
+    </w:p>
+    <w:p>
+      <w:pPr>
+        <w:spacing w:after="140"/>
+      </w:pPr>
+      <w:r>
+        <w:t>Después de tu revisión, aplicar el retiro en mantenimiento:</w:t>
+      </w:r>
+    </w:p>
+    <w:p>
+      <w:pPr>
+        <w:keepLines/>
+        <w:spacing w:after="140"/>
+      </w:pPr>
+      <w:r>
+        <w:rPr>
+          <w:rFonts w:ascii="Consolas" w:hAnsi="Consolas"/>
+          <w:sz w:val="20"/>
+        </w:rPr>
+        <w:t>.\Limpiar-BD.bat --area 51001 --aplicar --confirmar RETIRAR:51001</w:t>
+      </w:r>
+      <w:r>
+        <w:br/>
+      </w:r>
+      <w:r>
+        <w:rPr>
+          <w:rFonts w:ascii="Consolas" w:hAnsi="Consolas"/>
+          <w:sz w:val="20"/>
+        </w:rPr>
+        <w:t>bash Limpiar-BD.sh --area 51001 --aplicar --confirmar RETIRAR:51001</w:t>
+      </w:r>
+    </w:p>
+    <w:p>
+      <w:pPr>
+        <w:spacing w:after="140"/>
+      </w:pPr>
+      <w:r>
+        <w:t>Conserva catálogos, archivos, accesos registrados y usuarios compartidos. Se bloquea si existen documentos, oficinas hijas, otros vínculos o cambios incompatibles. No vacía la base ni elimina documentos. Crea un respaldo antes del retiro y revierte la transacción ante errores. La restauración del respaldo requiere un procedimiento separado.</w:t>
+      </w:r>
+    </w:p>
+    <w:p>
+      <w:pPr>
+        <w:spacing w:after="140"/>
+      </w:pPr>
+      <w:r>
+        <w:t>Al terminar arrancar la aplicación con SGD.bat iniciar o bash SGD.sh iniciar y probar personalmente accesos, permisos y el recorrido del documento. No repetir los SQL de instalación inicial. Pruebas de los nuevos utilitarios: validación offline, sintaxis SQL y PL/pgSQL y flujo de lanzadores; aún no se ejecutó una carga ni un retiro real en tus bases. La primera prueba supervisada corresponde al laboratorio.</w:t>
       </w:r>
     </w:p>
     <w:sectPr>

</xml_diff>